<commit_message>
Bổ sung điều kiện mục Quy tắc nghiệp vụ
</commit_message>
<xml_diff>
--- a/Báo Cáo Dự Án Database.docx
+++ b/Báo Cáo Dự Án Database.docx
@@ -279,7 +279,7 @@
       </w:r>
       <w:r>
         <w:rPr>
-          <w:rStyle w:val="13"/>
+          <w:rStyle w:val="14"/>
           <w:bCs/>
           <w:color w:val="000000" w:themeColor="text1"/>
           <w14:textFill>
@@ -292,7 +292,7 @@
       </w:r>
       <w:r>
         <w:rPr>
-          <w:rStyle w:val="13"/>
+          <w:rStyle w:val="14"/>
           <w:bCs/>
           <w:color w:val="000000" w:themeColor="text1"/>
           <w14:textFill>
@@ -352,7 +352,7 @@
       </w:r>
       <w:r>
         <w:rPr>
-          <w:rStyle w:val="13"/>
+          <w:rStyle w:val="14"/>
           <w:bCs/>
           <w:color w:val="000000" w:themeColor="text1"/>
           <w14:textFill>
@@ -365,7 +365,7 @@
       </w:r>
       <w:r>
         <w:rPr>
-          <w:rStyle w:val="13"/>
+          <w:rStyle w:val="14"/>
           <w:bCs/>
           <w:color w:val="000000" w:themeColor="text1"/>
           <w14:textFill>
@@ -425,7 +425,7 @@
       </w:r>
       <w:r>
         <w:rPr>
-          <w:rStyle w:val="13"/>
+          <w:rStyle w:val="14"/>
           <w:bCs/>
           <w:color w:val="000000" w:themeColor="text1"/>
           <w14:textFill>
@@ -438,7 +438,7 @@
       </w:r>
       <w:r>
         <w:rPr>
-          <w:rStyle w:val="13"/>
+          <w:rStyle w:val="14"/>
           <w:bCs/>
           <w:color w:val="000000" w:themeColor="text1"/>
           <w14:textFill>
@@ -529,7 +529,7 @@
     </w:p>
     <w:p>
       <w:pPr>
-        <w:pStyle w:val="32"/>
+        <w:pStyle w:val="33"/>
         <w:numPr>
           <w:ilvl w:val="0"/>
           <w:numId w:val="1"/>
@@ -565,7 +565,7 @@
     </w:p>
     <w:p>
       <w:pPr>
-        <w:pStyle w:val="32"/>
+        <w:pStyle w:val="33"/>
         <w:numPr>
           <w:ilvl w:val="1"/>
           <w:numId w:val="1"/>
@@ -601,7 +601,7 @@
     </w:p>
     <w:p>
       <w:pPr>
-        <w:pStyle w:val="32"/>
+        <w:pStyle w:val="33"/>
         <w:numPr>
           <w:ilvl w:val="0"/>
           <w:numId w:val="2"/>
@@ -629,7 +629,7 @@
     </w:p>
     <w:p>
       <w:pPr>
-        <w:pStyle w:val="32"/>
+        <w:pStyle w:val="33"/>
         <w:numPr>
           <w:ilvl w:val="0"/>
           <w:numId w:val="3"/>
@@ -657,7 +657,7 @@
     </w:p>
     <w:p>
       <w:pPr>
-        <w:pStyle w:val="32"/>
+        <w:pStyle w:val="33"/>
         <w:numPr>
           <w:ilvl w:val="0"/>
           <w:numId w:val="3"/>
@@ -685,7 +685,7 @@
     </w:p>
     <w:p>
       <w:pPr>
-        <w:pStyle w:val="32"/>
+        <w:pStyle w:val="33"/>
         <w:numPr>
           <w:ilvl w:val="0"/>
           <w:numId w:val="3"/>
@@ -713,7 +713,7 @@
     </w:p>
     <w:p>
       <w:pPr>
-        <w:pStyle w:val="32"/>
+        <w:pStyle w:val="33"/>
         <w:numPr>
           <w:ilvl w:val="0"/>
           <w:numId w:val="3"/>
@@ -741,7 +741,7 @@
     </w:p>
     <w:p>
       <w:pPr>
-        <w:pStyle w:val="32"/>
+        <w:pStyle w:val="33"/>
         <w:numPr>
           <w:ilvl w:val="0"/>
           <w:numId w:val="2"/>
@@ -769,7 +769,7 @@
     </w:p>
     <w:p>
       <w:pPr>
-        <w:pStyle w:val="32"/>
+        <w:pStyle w:val="33"/>
         <w:numPr>
           <w:ilvl w:val="0"/>
           <w:numId w:val="4"/>
@@ -798,7 +798,7 @@
     </w:p>
     <w:p>
       <w:pPr>
-        <w:pStyle w:val="32"/>
+        <w:pStyle w:val="33"/>
         <w:numPr>
           <w:ilvl w:val="0"/>
           <w:numId w:val="4"/>
@@ -827,7 +827,7 @@
     </w:p>
     <w:p>
       <w:pPr>
-        <w:pStyle w:val="32"/>
+        <w:pStyle w:val="33"/>
         <w:numPr>
           <w:ilvl w:val="0"/>
           <w:numId w:val="4"/>
@@ -856,7 +856,7 @@
     </w:p>
     <w:p>
       <w:pPr>
-        <w:pStyle w:val="32"/>
+        <w:pStyle w:val="33"/>
         <w:numPr>
           <w:ilvl w:val="0"/>
           <w:numId w:val="4"/>
@@ -885,7 +885,7 @@
     </w:p>
     <w:p>
       <w:pPr>
-        <w:pStyle w:val="32"/>
+        <w:pStyle w:val="33"/>
         <w:numPr>
           <w:ilvl w:val="0"/>
           <w:numId w:val="4"/>
@@ -914,7 +914,7 @@
     </w:p>
     <w:p>
       <w:pPr>
-        <w:pStyle w:val="32"/>
+        <w:pStyle w:val="33"/>
         <w:numPr>
           <w:ilvl w:val="0"/>
           <w:numId w:val="2"/>
@@ -942,7 +942,7 @@
     </w:p>
     <w:p>
       <w:pPr>
-        <w:pStyle w:val="32"/>
+        <w:pStyle w:val="33"/>
         <w:numPr>
           <w:ilvl w:val="0"/>
           <w:numId w:val="5"/>
@@ -970,7 +970,7 @@
     </w:p>
     <w:p>
       <w:pPr>
-        <w:pStyle w:val="32"/>
+        <w:pStyle w:val="33"/>
         <w:numPr>
           <w:ilvl w:val="0"/>
           <w:numId w:val="5"/>
@@ -998,7 +998,7 @@
     </w:p>
     <w:p>
       <w:pPr>
-        <w:pStyle w:val="32"/>
+        <w:pStyle w:val="33"/>
         <w:numPr>
           <w:ilvl w:val="0"/>
           <w:numId w:val="5"/>
@@ -1026,7 +1026,7 @@
     </w:p>
     <w:p>
       <w:pPr>
-        <w:pStyle w:val="32"/>
+        <w:pStyle w:val="33"/>
         <w:numPr>
           <w:ilvl w:val="0"/>
           <w:numId w:val="5"/>
@@ -1054,7 +1054,7 @@
     </w:p>
     <w:p>
       <w:pPr>
-        <w:pStyle w:val="32"/>
+        <w:pStyle w:val="33"/>
         <w:numPr>
           <w:ilvl w:val="0"/>
           <w:numId w:val="5"/>
@@ -1082,7 +1082,7 @@
     </w:p>
     <w:p>
       <w:pPr>
-        <w:pStyle w:val="32"/>
+        <w:pStyle w:val="33"/>
         <w:numPr>
           <w:ilvl w:val="0"/>
           <w:numId w:val="5"/>
@@ -1110,7 +1110,7 @@
     </w:p>
     <w:p>
       <w:pPr>
-        <w:pStyle w:val="32"/>
+        <w:pStyle w:val="33"/>
         <w:numPr>
           <w:ilvl w:val="1"/>
           <w:numId w:val="1"/>
@@ -1170,7 +1170,7 @@
     </w:p>
     <w:p>
       <w:pPr>
-        <w:pStyle w:val="32"/>
+        <w:pStyle w:val="33"/>
         <w:numPr>
           <w:ilvl w:val="0"/>
           <w:numId w:val="6"/>
@@ -1211,7 +1211,7 @@
     </w:p>
     <w:p>
       <w:pPr>
-        <w:pStyle w:val="32"/>
+        <w:pStyle w:val="33"/>
         <w:numPr>
           <w:ilvl w:val="0"/>
           <w:numId w:val="7"/>
@@ -1254,7 +1254,7 @@
     </w:p>
     <w:p>
       <w:pPr>
-        <w:pStyle w:val="32"/>
+        <w:pStyle w:val="33"/>
         <w:numPr>
           <w:ilvl w:val="0"/>
           <w:numId w:val="7"/>
@@ -1282,7 +1282,7 @@
     </w:p>
     <w:p>
       <w:pPr>
-        <w:pStyle w:val="32"/>
+        <w:pStyle w:val="33"/>
         <w:numPr>
           <w:ilvl w:val="0"/>
           <w:numId w:val="6"/>
@@ -1323,7 +1323,7 @@
     </w:p>
     <w:p>
       <w:pPr>
-        <w:pStyle w:val="32"/>
+        <w:pStyle w:val="33"/>
         <w:numPr>
           <w:ilvl w:val="0"/>
           <w:numId w:val="7"/>
@@ -1351,7 +1351,7 @@
     </w:p>
     <w:p>
       <w:pPr>
-        <w:pStyle w:val="32"/>
+        <w:pStyle w:val="33"/>
         <w:numPr>
           <w:ilvl w:val="0"/>
           <w:numId w:val="7"/>
@@ -1379,7 +1379,7 @@
     </w:p>
     <w:p>
       <w:pPr>
-        <w:pStyle w:val="32"/>
+        <w:pStyle w:val="33"/>
         <w:numPr>
           <w:ilvl w:val="0"/>
           <w:numId w:val="8"/>
@@ -1407,7 +1407,7 @@
     </w:p>
     <w:p>
       <w:pPr>
-        <w:pStyle w:val="32"/>
+        <w:pStyle w:val="33"/>
         <w:numPr>
           <w:ilvl w:val="0"/>
           <w:numId w:val="8"/>
@@ -1435,7 +1435,7 @@
     </w:p>
     <w:p>
       <w:pPr>
-        <w:pStyle w:val="32"/>
+        <w:pStyle w:val="33"/>
         <w:numPr>
           <w:ilvl w:val="0"/>
           <w:numId w:val="8"/>
@@ -1463,7 +1463,7 @@
     </w:p>
     <w:p>
       <w:pPr>
-        <w:pStyle w:val="32"/>
+        <w:pStyle w:val="33"/>
         <w:numPr>
           <w:ilvl w:val="0"/>
           <w:numId w:val="6"/>
@@ -1503,7 +1503,7 @@
     </w:p>
     <w:p>
       <w:pPr>
-        <w:pStyle w:val="32"/>
+        <w:pStyle w:val="33"/>
         <w:ind w:left="2061"/>
         <w:rPr>
           <w:i/>
@@ -1532,7 +1532,7 @@
     </w:p>
     <w:p>
       <w:pPr>
-        <w:pStyle w:val="32"/>
+        <w:pStyle w:val="33"/>
         <w:ind w:left="2061"/>
         <w:rPr>
           <w:i/>
@@ -1548,7 +1548,7 @@
     </w:p>
     <w:p>
       <w:pPr>
-        <w:pStyle w:val="32"/>
+        <w:pStyle w:val="33"/>
         <w:numPr>
           <w:ilvl w:val="0"/>
           <w:numId w:val="7"/>
@@ -1624,7 +1624,7 @@
     </w:p>
     <w:p>
       <w:pPr>
-        <w:pStyle w:val="32"/>
+        <w:pStyle w:val="33"/>
         <w:numPr>
           <w:ilvl w:val="0"/>
           <w:numId w:val="7"/>
@@ -1652,7 +1652,7 @@
     </w:p>
     <w:p>
       <w:pPr>
-        <w:pStyle w:val="32"/>
+        <w:pStyle w:val="33"/>
         <w:numPr>
           <w:ilvl w:val="0"/>
           <w:numId w:val="7"/>
@@ -1680,7 +1680,7 @@
     </w:p>
     <w:p>
       <w:pPr>
-        <w:pStyle w:val="32"/>
+        <w:pStyle w:val="33"/>
         <w:numPr>
           <w:ilvl w:val="0"/>
           <w:numId w:val="6"/>
@@ -1720,7 +1720,7 @@
     </w:p>
     <w:p>
       <w:pPr>
-        <w:pStyle w:val="32"/>
+        <w:pStyle w:val="33"/>
         <w:ind w:left="2061"/>
         <w:rPr>
           <w:i/>
@@ -1749,7 +1749,7 @@
     </w:p>
     <w:p>
       <w:pPr>
-        <w:pStyle w:val="32"/>
+        <w:pStyle w:val="33"/>
         <w:ind w:left="2061"/>
         <w:rPr>
           <w:i/>
@@ -1765,7 +1765,7 @@
     </w:p>
     <w:p>
       <w:pPr>
-        <w:pStyle w:val="32"/>
+        <w:pStyle w:val="33"/>
         <w:numPr>
           <w:ilvl w:val="0"/>
           <w:numId w:val="7"/>
@@ -1817,7 +1817,7 @@
     </w:p>
     <w:p>
       <w:pPr>
-        <w:pStyle w:val="32"/>
+        <w:pStyle w:val="33"/>
         <w:numPr>
           <w:ilvl w:val="0"/>
           <w:numId w:val="7"/>
@@ -1869,7 +1869,7 @@
     </w:p>
     <w:p>
       <w:pPr>
-        <w:pStyle w:val="32"/>
+        <w:pStyle w:val="33"/>
         <w:numPr>
           <w:ilvl w:val="0"/>
           <w:numId w:val="9"/>
@@ -1912,7 +1912,7 @@
     </w:p>
     <w:p>
       <w:pPr>
-        <w:pStyle w:val="32"/>
+        <w:pStyle w:val="33"/>
         <w:ind w:left="0"/>
         <w:rPr>
           <w:color w:val="000000" w:themeColor="text1"/>
@@ -1926,7 +1926,7 @@
     </w:p>
     <w:p>
       <w:pPr>
-        <w:pStyle w:val="32"/>
+        <w:pStyle w:val="33"/>
         <w:ind w:firstLine="720"/>
         <w:rPr>
           <w:rFonts w:ascii="Calibri" w:hAnsi="Calibri" w:eastAsia="SimSun" w:cs="Calibri"/>
@@ -1949,7 +1949,7 @@
     </w:p>
     <w:p>
       <w:pPr>
-        <w:pStyle w:val="32"/>
+        <w:pStyle w:val="33"/>
         <w:ind w:left="1680"/>
         <w:rPr>
           <w:rFonts w:ascii="Calibri" w:hAnsi="Calibri" w:eastAsia="SimSun" w:cs="Calibri"/>
@@ -1964,7 +1964,7 @@
     </w:p>
     <w:p>
       <w:pPr>
-        <w:pStyle w:val="32"/>
+        <w:pStyle w:val="33"/>
         <w:ind w:firstLine="720"/>
         <w:rPr>
           <w:rFonts w:ascii="Calibri" w:hAnsi="Calibri" w:eastAsia="SimSun" w:cs="Calibri"/>
@@ -1983,7 +1983,7 @@
     </w:p>
     <w:p>
       <w:pPr>
-        <w:pStyle w:val="32"/>
+        <w:pStyle w:val="33"/>
         <w:numPr>
           <w:ilvl w:val="0"/>
           <w:numId w:val="10"/>
@@ -2005,7 +2005,7 @@
     </w:p>
     <w:p>
       <w:pPr>
-        <w:pStyle w:val="32"/>
+        <w:pStyle w:val="33"/>
         <w:numPr>
           <w:ilvl w:val="0"/>
           <w:numId w:val="10"/>
@@ -2027,7 +2027,7 @@
     </w:p>
     <w:p>
       <w:pPr>
-        <w:pStyle w:val="32"/>
+        <w:pStyle w:val="33"/>
         <w:numPr>
           <w:ilvl w:val="0"/>
           <w:numId w:val="10"/>
@@ -2049,7 +2049,7 @@
     </w:p>
     <w:p>
       <w:pPr>
-        <w:pStyle w:val="32"/>
+        <w:pStyle w:val="33"/>
         <w:numPr>
           <w:ilvl w:val="0"/>
           <w:numId w:val="10"/>
@@ -2071,7 +2071,7 @@
     </w:p>
     <w:p>
       <w:pPr>
-        <w:pStyle w:val="32"/>
+        <w:pStyle w:val="33"/>
         <w:ind w:firstLine="720"/>
         <w:rPr>
           <w:rFonts w:ascii="Calibri" w:hAnsi="Calibri" w:eastAsia="SimSun" w:cs="Calibri"/>
@@ -2090,7 +2090,7 @@
     </w:p>
     <w:p>
       <w:pPr>
-        <w:pStyle w:val="32"/>
+        <w:pStyle w:val="33"/>
         <w:numPr>
           <w:ilvl w:val="0"/>
           <w:numId w:val="10"/>
@@ -2109,7 +2109,7 @@
     </w:p>
     <w:p>
       <w:pPr>
-        <w:pStyle w:val="32"/>
+        <w:pStyle w:val="33"/>
         <w:numPr>
           <w:ilvl w:val="0"/>
           <w:numId w:val="10"/>
@@ -2128,7 +2128,7 @@
     </w:p>
     <w:p>
       <w:pPr>
-        <w:pStyle w:val="32"/>
+        <w:pStyle w:val="33"/>
         <w:numPr>
           <w:ilvl w:val="0"/>
           <w:numId w:val="10"/>
@@ -2147,7 +2147,7 @@
     </w:p>
     <w:p>
       <w:pPr>
-        <w:pStyle w:val="32"/>
+        <w:pStyle w:val="33"/>
         <w:numPr>
           <w:ilvl w:val="0"/>
           <w:numId w:val="10"/>
@@ -2166,7 +2166,7 @@
     </w:p>
     <w:p>
       <w:pPr>
-        <w:pStyle w:val="32"/>
+        <w:pStyle w:val="33"/>
         <w:ind w:firstLine="720"/>
         <w:rPr>
           <w:rFonts w:ascii="Calibri" w:hAnsi="Calibri" w:eastAsia="SimSun" w:cs="Calibri"/>
@@ -2185,7 +2185,7 @@
     </w:p>
     <w:p>
       <w:pPr>
-        <w:pStyle w:val="32"/>
+        <w:pStyle w:val="33"/>
         <w:numPr>
           <w:ilvl w:val="0"/>
           <w:numId w:val="10"/>
@@ -2204,7 +2204,7 @@
     </w:p>
     <w:p>
       <w:pPr>
-        <w:pStyle w:val="32"/>
+        <w:pStyle w:val="33"/>
         <w:numPr>
           <w:ilvl w:val="0"/>
           <w:numId w:val="10"/>
@@ -2223,7 +2223,7 @@
     </w:p>
     <w:p>
       <w:pPr>
-        <w:pStyle w:val="32"/>
+        <w:pStyle w:val="33"/>
         <w:numPr>
           <w:ilvl w:val="0"/>
           <w:numId w:val="10"/>
@@ -2242,7 +2242,7 @@
     </w:p>
     <w:p>
       <w:pPr>
-        <w:pStyle w:val="32"/>
+        <w:pStyle w:val="33"/>
         <w:numPr>
           <w:ilvl w:val="0"/>
           <w:numId w:val="10"/>
@@ -2261,7 +2261,7 @@
     </w:p>
     <w:p>
       <w:pPr>
-        <w:pStyle w:val="32"/>
+        <w:pStyle w:val="33"/>
         <w:numPr>
           <w:ilvl w:val="0"/>
           <w:numId w:val="10"/>
@@ -2280,7 +2280,7 @@
     </w:p>
     <w:p>
       <w:pPr>
-        <w:pStyle w:val="32"/>
+        <w:pStyle w:val="33"/>
         <w:numPr>
           <w:ilvl w:val="0"/>
           <w:numId w:val="10"/>
@@ -2294,12 +2294,20 @@
         <w:rPr>
           <w:rFonts w:ascii="Calibri" w:hAnsi="Calibri" w:eastAsia="SimSun" w:cs="Calibri"/>
         </w:rPr>
-        <w:t>Nếu ngày trả thực tế (Return_Date) có giá trị thì phải lớn hơn hoặc bằng ngày mượn (Loan_Date).</w:t>
-      </w:r>
-    </w:p>
-    <w:p>
-      <w:pPr>
-        <w:pStyle w:val="32"/>
+        <w:t xml:space="preserve">Nếu ngày trả thực tế (Return_Date) có giá trị thì phải lớn hơn hoặc bằng ngày </w:t>
+      </w:r>
+      <w:bookmarkStart w:id="0" w:name="_GoBack"/>
+      <w:bookmarkEnd w:id="0"/>
+      <w:r>
+        <w:rPr>
+          <w:rFonts w:ascii="Calibri" w:hAnsi="Calibri" w:eastAsia="SimSun" w:cs="Calibri"/>
+        </w:rPr>
+        <w:t>mượn (Loan_Date).</w:t>
+      </w:r>
+    </w:p>
+    <w:p>
+      <w:pPr>
+        <w:pStyle w:val="33"/>
         <w:numPr>
           <w:ilvl w:val="0"/>
           <w:numId w:val="10"/>
@@ -2313,12 +2321,12 @@
         <w:rPr>
           <w:rFonts w:ascii="Calibri" w:hAnsi="Calibri" w:eastAsia="SimSun" w:cs="Calibri"/>
         </w:rPr>
-        <w:t>Hạn mức mượn tối đa: Một Member chỉ được mượn tối đa 05 Book_Copy cùng một thời điểm (tính trên tổng số Loaned_Copy chưa trả).</w:t>
-      </w:r>
-    </w:p>
-    <w:p>
-      <w:pPr>
-        <w:pStyle w:val="32"/>
+        <w:t>Hạn mức mượn tối đa: Một Member chỉ được mượn tối đa 05 Book_Copy cùng một thời điểm, được tính trên tổng số Loaned_Copy chưa trả (Return_Date IS NULL).</w:t>
+      </w:r>
+    </w:p>
+    <w:p>
+      <w:pPr>
+        <w:pStyle w:val="33"/>
         <w:numPr>
           <w:ilvl w:val="0"/>
           <w:numId w:val="10"/>
@@ -2332,12 +2340,120 @@
         <w:rPr>
           <w:rFonts w:ascii="Calibri" w:hAnsi="Calibri" w:eastAsia="SimSun" w:cs="Calibri"/>
         </w:rPr>
-        <w:t>Điều kiện tạm dừng mượn: Member không được phép tạo Loan_Record mới nếu đang có ít nhất một Loaned_Copy quá hạn chưa trả</w:t>
-      </w:r>
-    </w:p>
-    <w:p>
-      <w:pPr>
-        <w:pStyle w:val="32"/>
+        <w:t>Member không được phép tạo Loan_Record mới nếu đang có ít nhất một Loaned_Copy quá hạn chưa trả</w:t>
+      </w:r>
+      <w:r>
+        <w:rPr>
+          <w:rFonts w:hint="default" w:ascii="Calibri" w:hAnsi="Calibri" w:eastAsia="SimSun" w:cs="Calibri"/>
+          <w:lang w:val="en-US"/>
+        </w:rPr>
+        <w:t xml:space="preserve"> (Return_Date IS NULL và Ngày hiện tại &gt; Due_Date)</w:t>
+      </w:r>
+    </w:p>
+    <w:p>
+      <w:pPr>
+        <w:pStyle w:val="33"/>
+        <w:numPr>
+          <w:ilvl w:val="0"/>
+          <w:numId w:val="10"/>
+        </w:numPr>
+        <w:ind w:left="2105"/>
+        <w:rPr>
+          <w:rFonts w:ascii="Calibri" w:hAnsi="Calibri" w:eastAsia="SimSun" w:cs="Calibri"/>
+        </w:rPr>
+      </w:pPr>
+      <w:r>
+        <w:rPr>
+          <w:rFonts w:ascii="Calibri" w:hAnsi="Calibri" w:eastAsia="SimSun" w:cs="Calibri"/>
+        </w:rPr>
+        <w:t>Member không được phép tạo Loan_Record mới nếu còn ít nhất một Fine chưa được thanh toán</w:t>
+      </w:r>
+      <w:r>
+        <w:rPr>
+          <w:rFonts w:hint="default" w:ascii="Calibri" w:hAnsi="Calibri" w:eastAsia="SimSun" w:cs="Calibri"/>
+          <w:lang w:val="en-US"/>
+        </w:rPr>
+        <w:t xml:space="preserve"> (Paid_Status = ‘Unpaid’)</w:t>
+      </w:r>
+      <w:r>
+        <w:rPr>
+          <w:rFonts w:ascii="Calibri" w:hAnsi="Calibri" w:eastAsia="SimSun" w:cs="Calibri"/>
+        </w:rPr>
+        <w:t>.</w:t>
+      </w:r>
+    </w:p>
+    <w:p>
+      <w:pPr>
+        <w:pStyle w:val="33"/>
+        <w:numPr>
+          <w:ilvl w:val="0"/>
+          <w:numId w:val="10"/>
+        </w:numPr>
+        <w:ind w:left="2105"/>
+        <w:rPr>
+          <w:rFonts w:ascii="Calibri" w:hAnsi="Calibri" w:eastAsia="SimSun" w:cs="Calibri"/>
+        </w:rPr>
+      </w:pPr>
+      <w:r>
+        <w:rPr>
+          <w:rFonts w:ascii="Calibri" w:hAnsi="Calibri" w:eastAsia="SimSun" w:cs="Calibri"/>
+          <w:b/>
+          <w:bCs/>
+        </w:rPr>
+        <w:t>Điều kiện được phép mượn tiếp</w:t>
+      </w:r>
+      <w:r>
+        <w:rPr>
+          <w:rFonts w:ascii="Calibri" w:hAnsi="Calibri" w:eastAsia="SimSun" w:cs="Calibri"/>
+        </w:rPr>
+        <w:t xml:space="preserve">: Member chỉ được phép tạo Loan_Record mới khi đồng thời thỏa mãn các điều kiện tại </w:t>
+      </w:r>
+      <w:r>
+        <w:rPr>
+          <w:rFonts w:ascii="Calibri" w:hAnsi="Calibri" w:eastAsia="SimSun" w:cs="Calibri"/>
+          <w:b/>
+          <w:bCs/>
+        </w:rPr>
+        <w:t>Quy tắc 15</w:t>
+      </w:r>
+      <w:r>
+        <w:rPr>
+          <w:rFonts w:ascii="Calibri" w:hAnsi="Calibri" w:eastAsia="SimSun" w:cs="Calibri"/>
+        </w:rPr>
+        <w:t xml:space="preserve">, </w:t>
+      </w:r>
+      <w:r>
+        <w:rPr>
+          <w:rFonts w:ascii="Calibri" w:hAnsi="Calibri" w:eastAsia="SimSun" w:cs="Calibri"/>
+          <w:b/>
+          <w:bCs/>
+        </w:rPr>
+        <w:t xml:space="preserve">16 </w:t>
+      </w:r>
+      <w:r>
+        <w:rPr>
+          <w:rFonts w:ascii="Calibri" w:hAnsi="Calibri" w:eastAsia="SimSun" w:cs="Calibri"/>
+        </w:rPr>
+        <w:t xml:space="preserve">và </w:t>
+      </w:r>
+      <w:r>
+        <w:rPr>
+          <w:rFonts w:ascii="Calibri" w:hAnsi="Calibri" w:eastAsia="SimSun" w:cs="Calibri"/>
+          <w:b/>
+          <w:bCs/>
+        </w:rPr>
+        <w:t>17</w:t>
+      </w:r>
+      <w:r>
+        <w:rPr>
+          <w:rFonts w:ascii="Calibri" w:hAnsi="Calibri" w:eastAsia="SimSun" w:cs="Calibri"/>
+        </w:rPr>
+        <w:t>. Cụ thể, số lượng sách đang mượn phải nhỏ hơn 05, không có sách quá hạn chưa trả và không còn tiền phạt chưa thanh toán.</w:t>
+      </w:r>
+    </w:p>
+    <w:p>
+      <w:pPr>
+        <w:pStyle w:val="33"/>
         <w:ind w:firstLine="720"/>
         <w:rPr>
           <w:rFonts w:ascii="Calibri" w:hAnsi="Calibri" w:eastAsia="SimSun" w:cs="Calibri"/>
@@ -2356,7 +2472,7 @@
     </w:p>
     <w:p>
       <w:pPr>
-        <w:pStyle w:val="32"/>
+        <w:pStyle w:val="33"/>
         <w:numPr>
           <w:ilvl w:val="0"/>
           <w:numId w:val="10"/>
@@ -2375,7 +2491,7 @@
     </w:p>
     <w:p>
       <w:pPr>
-        <w:pStyle w:val="32"/>
+        <w:pStyle w:val="33"/>
         <w:numPr>
           <w:ilvl w:val="0"/>
           <w:numId w:val="10"/>
@@ -2394,7 +2510,7 @@
     </w:p>
     <w:p>
       <w:pPr>
-        <w:pStyle w:val="32"/>
+        <w:pStyle w:val="33"/>
         <w:ind w:firstLine="720"/>
         <w:rPr>
           <w:rFonts w:ascii="Calibri" w:hAnsi="Calibri" w:eastAsia="SimSun" w:cs="Calibri"/>
@@ -2413,7 +2529,7 @@
     </w:p>
     <w:p>
       <w:pPr>
-        <w:pStyle w:val="32"/>
+        <w:pStyle w:val="33"/>
         <w:numPr>
           <w:ilvl w:val="0"/>
           <w:numId w:val="10"/>
@@ -2432,7 +2548,7 @@
     </w:p>
     <w:p>
       <w:pPr>
-        <w:pStyle w:val="32"/>
+        <w:pStyle w:val="33"/>
         <w:numPr>
           <w:ilvl w:val="0"/>
           <w:numId w:val="10"/>
@@ -2451,7 +2567,7 @@
     </w:p>
     <w:p>
       <w:pPr>
-        <w:pStyle w:val="32"/>
+        <w:pStyle w:val="33"/>
         <w:ind w:firstLine="720"/>
         <w:rPr>
           <w:rFonts w:ascii="Calibri" w:hAnsi="Calibri" w:eastAsia="SimSun" w:cs="Calibri"/>
@@ -2470,7 +2586,7 @@
     </w:p>
     <w:p>
       <w:pPr>
-        <w:pStyle w:val="32"/>
+        <w:pStyle w:val="33"/>
         <w:numPr>
           <w:ilvl w:val="0"/>
           <w:numId w:val="10"/>
@@ -2490,7 +2606,7 @@
     </w:p>
     <w:p>
       <w:pPr>
-        <w:pStyle w:val="32"/>
+        <w:pStyle w:val="33"/>
         <w:numPr>
           <w:ilvl w:val="0"/>
           <w:numId w:val="10"/>
@@ -2509,7 +2625,7 @@
     </w:p>
     <w:p>
       <w:pPr>
-        <w:pStyle w:val="32"/>
+        <w:pStyle w:val="33"/>
         <w:ind w:firstLine="720"/>
         <w:rPr>
           <w:rFonts w:ascii="Calibri" w:hAnsi="Calibri" w:eastAsia="SimSun" w:cs="Calibri"/>
@@ -2528,7 +2644,7 @@
     </w:p>
     <w:p>
       <w:pPr>
-        <w:pStyle w:val="32"/>
+        <w:pStyle w:val="33"/>
         <w:numPr>
           <w:ilvl w:val="0"/>
           <w:numId w:val="10"/>
@@ -2547,7 +2663,7 @@
     </w:p>
     <w:p>
       <w:pPr>
-        <w:pStyle w:val="32"/>
+        <w:pStyle w:val="33"/>
         <w:numPr>
           <w:ilvl w:val="0"/>
           <w:numId w:val="10"/>
@@ -2566,7 +2682,7 @@
     </w:p>
     <w:p>
       <w:pPr>
-        <w:pStyle w:val="32"/>
+        <w:pStyle w:val="33"/>
         <w:numPr>
           <w:ilvl w:val="0"/>
           <w:numId w:val="10"/>
@@ -2585,7 +2701,7 @@
     </w:p>
     <w:p>
       <w:pPr>
-        <w:pStyle w:val="32"/>
+        <w:pStyle w:val="33"/>
         <w:numPr>
           <w:ilvl w:val="0"/>
           <w:numId w:val="10"/>
@@ -2618,7 +2734,7 @@
     </w:p>
     <w:p>
       <w:pPr>
-        <w:pStyle w:val="32"/>
+        <w:pStyle w:val="33"/>
         <w:numPr>
           <w:ilvl w:val="0"/>
           <w:numId w:val="10"/>
@@ -2637,7 +2753,7 @@
     </w:p>
     <w:p>
       <w:pPr>
-        <w:pStyle w:val="32"/>
+        <w:pStyle w:val="33"/>
         <w:ind w:left="2160" w:firstLine="720"/>
         <w:rPr>
           <w:rFonts w:ascii="Calibri" w:hAnsi="Calibri" w:eastAsia="SimSun" w:cs="Calibri"/>
@@ -2669,7 +2785,7 @@
     </w:p>
     <w:p>
       <w:pPr>
-        <w:pStyle w:val="32"/>
+        <w:pStyle w:val="33"/>
         <w:ind w:left="2160" w:firstLine="720"/>
         <w:rPr>
           <w:rFonts w:ascii="Calibri" w:hAnsi="Calibri" w:eastAsia="SimSun" w:cs="Calibri"/>
@@ -2686,7 +2802,7 @@
     </w:p>
     <w:p>
       <w:pPr>
-        <w:pStyle w:val="32"/>
+        <w:pStyle w:val="33"/>
         <w:tabs>
           <w:tab w:val="left" w:pos="240"/>
         </w:tabs>
@@ -2721,7 +2837,7 @@
     </w:p>
     <w:p>
       <w:pPr>
-        <w:pStyle w:val="32"/>
+        <w:pStyle w:val="33"/>
         <w:tabs>
           <w:tab w:val="left" w:pos="240"/>
         </w:tabs>
@@ -2741,7 +2857,7 @@
     </w:p>
     <w:p>
       <w:pPr>
-        <w:pStyle w:val="32"/>
+        <w:pStyle w:val="33"/>
         <w:tabs>
           <w:tab w:val="left" w:pos="240"/>
         </w:tabs>
@@ -2754,7 +2870,7 @@
     </w:p>
     <w:p>
       <w:pPr>
-        <w:pStyle w:val="32"/>
+        <w:pStyle w:val="33"/>
         <w:ind w:firstLine="720"/>
         <w:rPr>
           <w:rFonts w:ascii="Calibri" w:hAnsi="Calibri" w:eastAsia="SimSun" w:cs="Calibri"/>
@@ -2773,7 +2889,7 @@
     </w:p>
     <w:p>
       <w:pPr>
-        <w:pStyle w:val="32"/>
+        <w:pStyle w:val="33"/>
         <w:numPr>
           <w:ilvl w:val="0"/>
           <w:numId w:val="10"/>
@@ -2792,7 +2908,7 @@
     </w:p>
     <w:p>
       <w:pPr>
-        <w:pStyle w:val="32"/>
+        <w:pStyle w:val="33"/>
         <w:numPr>
           <w:ilvl w:val="0"/>
           <w:numId w:val="10"/>
@@ -2811,7 +2927,7 @@
     </w:p>
     <w:p>
       <w:pPr>
-        <w:pStyle w:val="32"/>
+        <w:pStyle w:val="33"/>
         <w:numPr>
           <w:ilvl w:val="0"/>
           <w:numId w:val="10"/>
@@ -2830,7 +2946,7 @@
     </w:p>
     <w:p>
       <w:pPr>
-        <w:pStyle w:val="32"/>
+        <w:pStyle w:val="33"/>
         <w:numPr>
           <w:ilvl w:val="0"/>
           <w:numId w:val="10"/>
@@ -2849,7 +2965,7 @@
     </w:p>
     <w:p>
       <w:pPr>
-        <w:pStyle w:val="32"/>
+        <w:pStyle w:val="33"/>
         <w:ind w:firstLine="720"/>
         <w:rPr>
           <w:rFonts w:ascii="Calibri" w:hAnsi="Calibri" w:eastAsia="SimSun" w:cs="Calibri"/>
@@ -2868,7 +2984,7 @@
     </w:p>
     <w:p>
       <w:pPr>
-        <w:pStyle w:val="32"/>
+        <w:pStyle w:val="33"/>
         <w:numPr>
           <w:ilvl w:val="0"/>
           <w:numId w:val="10"/>
@@ -2887,7 +3003,7 @@
     </w:p>
     <w:p>
       <w:pPr>
-        <w:pStyle w:val="32"/>
+        <w:pStyle w:val="33"/>
         <w:numPr>
           <w:ilvl w:val="0"/>
           <w:numId w:val="10"/>
@@ -2906,7 +3022,7 @@
     </w:p>
     <w:p>
       <w:pPr>
-        <w:pStyle w:val="32"/>
+        <w:pStyle w:val="33"/>
         <w:numPr>
           <w:ilvl w:val="0"/>
           <w:numId w:val="10"/>
@@ -2925,7 +3041,7 @@
     </w:p>
     <w:p>
       <w:pPr>
-        <w:pStyle w:val="32"/>
+        <w:pStyle w:val="33"/>
         <w:numPr>
           <w:ilvl w:val="0"/>
           <w:numId w:val="10"/>
@@ -2944,7 +3060,7 @@
     </w:p>
     <w:p>
       <w:pPr>
-        <w:pStyle w:val="32"/>
+        <w:pStyle w:val="33"/>
         <w:numPr>
           <w:ilvl w:val="0"/>
           <w:numId w:val="10"/>
@@ -2963,7 +3079,7 @@
     </w:p>
     <w:p>
       <w:pPr>
-        <w:pStyle w:val="32"/>
+        <w:pStyle w:val="33"/>
         <w:ind w:firstLine="720"/>
         <w:rPr>
           <w:rFonts w:ascii="Calibri" w:hAnsi="Calibri" w:eastAsia="SimSun" w:cs="Calibri"/>
@@ -2982,7 +3098,7 @@
     </w:p>
     <w:p>
       <w:pPr>
-        <w:pStyle w:val="32"/>
+        <w:pStyle w:val="33"/>
         <w:numPr>
           <w:ilvl w:val="0"/>
           <w:numId w:val="10"/>
@@ -3001,7 +3117,7 @@
     </w:p>
     <w:p>
       <w:pPr>
-        <w:pStyle w:val="32"/>
+        <w:pStyle w:val="33"/>
         <w:numPr>
           <w:ilvl w:val="0"/>
           <w:numId w:val="10"/>
@@ -3033,7 +3149,7 @@
     </w:p>
     <w:p>
       <w:pPr>
-        <w:pStyle w:val="32"/>
+        <w:pStyle w:val="33"/>
         <w:numPr>
           <w:ilvl w:val="0"/>
           <w:numId w:val="10"/>
@@ -3052,7 +3168,7 @@
     </w:p>
     <w:p>
       <w:pPr>
-        <w:pStyle w:val="32"/>
+        <w:pStyle w:val="33"/>
         <w:numPr>
           <w:ilvl w:val="0"/>
           <w:numId w:val="10"/>
@@ -3073,7 +3189,7 @@
     </w:p>
     <w:p>
       <w:pPr>
-        <w:pStyle w:val="32"/>
+        <w:pStyle w:val="33"/>
         <w:ind w:left="0"/>
         <w:rPr>
           <w:rFonts w:ascii="Calibri" w:hAnsi="Calibri" w:eastAsia="SimSun" w:cs="Calibri"/>
@@ -3082,7 +3198,7 @@
     </w:p>
     <w:p>
       <w:pPr>
-        <w:pStyle w:val="32"/>
+        <w:pStyle w:val="33"/>
         <w:ind w:left="0"/>
         <w:rPr>
           <w:rFonts w:ascii="Calibri" w:hAnsi="Calibri" w:eastAsia="SimSun" w:cs="Calibri"/>
@@ -3091,7 +3207,7 @@
     </w:p>
     <w:p>
       <w:pPr>
-        <w:pStyle w:val="32"/>
+        <w:pStyle w:val="33"/>
         <w:ind w:left="1440"/>
         <w:rPr>
           <w:rFonts w:eastAsia="SimSun" w:cstheme="minorHAnsi"/>
@@ -3110,7 +3226,7 @@
     </w:p>
     <w:p>
       <w:pPr>
-        <w:pStyle w:val="32"/>
+        <w:pStyle w:val="33"/>
         <w:ind w:left="0"/>
         <w:rPr>
           <w:rFonts w:ascii="SimSun" w:hAnsi="SimSun" w:eastAsia="SimSun" w:cs="SimSun"/>
@@ -3119,13 +3235,12 @@
     </w:p>
     <w:p>
       <w:pPr>
-        <w:pStyle w:val="32"/>
+        <w:pStyle w:val="33"/>
         <w:ind w:left="0"/>
         <w:rPr>
           <w:rFonts w:ascii="SimSun" w:hAnsi="SimSun" w:eastAsia="SimSun" w:cs="SimSun"/>
         </w:rPr>
       </w:pPr>
-      <w:bookmarkStart w:id="0" w:name="_GoBack"/>
       <w:r>
         <w:rPr>
           <w:rFonts w:ascii="SimSun" w:hAnsi="SimSun" w:eastAsia="SimSun" w:cs="SimSun"/>
@@ -3182,11 +3297,10 @@
           </wp:anchor>
         </w:drawing>
       </w:r>
-      <w:bookmarkEnd w:id="0"/>
-    </w:p>
-    <w:p>
-      <w:pPr>
-        <w:pStyle w:val="32"/>
+    </w:p>
+    <w:p>
+      <w:pPr>
+        <w:pStyle w:val="33"/>
         <w:ind w:left="0"/>
         <w:rPr>
           <w:rFonts w:ascii="SimSun" w:hAnsi="SimSun" w:eastAsia="SimSun" w:cs="SimSun"/>
@@ -3195,7 +3309,7 @@
     </w:p>
     <w:p>
       <w:pPr>
-        <w:pStyle w:val="32"/>
+        <w:pStyle w:val="33"/>
         <w:ind w:left="0"/>
         <w:rPr>
           <w:rFonts w:ascii="SimSun" w:hAnsi="SimSun" w:eastAsia="SimSun" w:cs="SimSun"/>
@@ -3207,7 +3321,7 @@
     <w:p/>
     <w:p>
       <w:pPr>
-        <w:pStyle w:val="32"/>
+        <w:pStyle w:val="33"/>
         <w:tabs>
           <w:tab w:val="left" w:pos="4176"/>
         </w:tabs>
@@ -3221,7 +3335,7 @@
     </w:p>
     <w:p>
       <w:pPr>
-        <w:pStyle w:val="32"/>
+        <w:pStyle w:val="33"/>
         <w:tabs>
           <w:tab w:val="left" w:pos="4176"/>
         </w:tabs>
@@ -3328,7 +3442,7 @@
     </w:p>
     <w:tbl>
       <w:tblPr>
-        <w:tblStyle w:val="17"/>
+        <w:tblStyle w:val="18"/>
         <w:tblW w:w="9942" w:type="dxa"/>
         <w:jc w:val="center"/>
         <w:tblBorders>
@@ -3480,7 +3594,7 @@
             </w:r>
             <w:r>
               <w:rPr>
-                <w:rStyle w:val="13"/>
+                <w:rStyle w:val="14"/>
                 <w:bCs/>
                 <w:color w:val="000000" w:themeColor="text1"/>
                 <w14:textFill>
@@ -3493,7 +3607,7 @@
             </w:r>
             <w:r>
               <w:rPr>
-                <w:rStyle w:val="13"/>
+                <w:rStyle w:val="14"/>
                 <w:bCs/>
                 <w:color w:val="000000" w:themeColor="text1"/>
                 <w14:textFill>
@@ -3590,7 +3704,7 @@
             </w:r>
             <w:r>
               <w:rPr>
-                <w:rStyle w:val="13"/>
+                <w:rStyle w:val="14"/>
                 <w:bCs/>
                 <w:color w:val="000000" w:themeColor="text1"/>
                 <w14:textFill>
@@ -3603,7 +3717,7 @@
             </w:r>
             <w:r>
               <w:rPr>
-                <w:rStyle w:val="13"/>
+                <w:rStyle w:val="14"/>
                 <w:bCs/>
                 <w:color w:val="000000" w:themeColor="text1"/>
                 <w14:textFill>
@@ -3700,7 +3814,7 @@
             </w:r>
             <w:r>
               <w:rPr>
-                <w:rStyle w:val="13"/>
+                <w:rStyle w:val="14"/>
                 <w:bCs/>
                 <w:color w:val="000000" w:themeColor="text1"/>
                 <w14:textFill>
@@ -3713,7 +3827,7 @@
             </w:r>
             <w:r>
               <w:rPr>
-                <w:rStyle w:val="13"/>
+                <w:rStyle w:val="14"/>
                 <w:bCs/>
                 <w:color w:val="000000" w:themeColor="text1"/>
                 <w14:textFill>
@@ -5018,7 +5132,7 @@
     <w:lsdException w:uiPriority="99" w:name="HTML Sample"/>
     <w:lsdException w:uiPriority="99" w:name="HTML Typewriter"/>
     <w:lsdException w:uiPriority="99" w:name="HTML Variable"/>
-    <w:lsdException w:uiPriority="99" w:name="Normal Table"/>
+    <w:lsdException w:qFormat="1" w:uiPriority="99" w:name="Normal Table"/>
     <w:lsdException w:uiPriority="99" w:name="annotation subject"/>
     <w:lsdException w:uiPriority="99" w:name="Table Simple 1"/>
     <w:lsdException w:uiPriority="99" w:name="Table Simple 2"/>
@@ -5187,7 +5301,7 @@
     <w:name w:val="heading 1"/>
     <w:basedOn w:val="1"/>
     <w:next w:val="1"/>
-    <w:link w:val="19"/>
+    <w:link w:val="20"/>
     <w:qFormat/>
     <w:uiPriority w:val="9"/>
     <w:pPr>
@@ -5207,7 +5321,7 @@
     <w:name w:val="heading 2"/>
     <w:basedOn w:val="1"/>
     <w:next w:val="1"/>
-    <w:link w:val="20"/>
+    <w:link w:val="21"/>
     <w:semiHidden/>
     <w:unhideWhenUsed/>
     <w:qFormat/>
@@ -5229,7 +5343,7 @@
     <w:name w:val="heading 3"/>
     <w:basedOn w:val="1"/>
     <w:next w:val="1"/>
-    <w:link w:val="21"/>
+    <w:link w:val="22"/>
     <w:semiHidden/>
     <w:unhideWhenUsed/>
     <w:qFormat/>
@@ -5251,7 +5365,7 @@
     <w:name w:val="heading 4"/>
     <w:basedOn w:val="1"/>
     <w:next w:val="1"/>
-    <w:link w:val="22"/>
+    <w:link w:val="23"/>
     <w:semiHidden/>
     <w:unhideWhenUsed/>
     <w:qFormat/>
@@ -5273,7 +5387,7 @@
     <w:name w:val="heading 5"/>
     <w:basedOn w:val="1"/>
     <w:next w:val="1"/>
-    <w:link w:val="23"/>
+    <w:link w:val="24"/>
     <w:semiHidden/>
     <w:unhideWhenUsed/>
     <w:qFormat/>
@@ -5293,7 +5407,7 @@
     <w:name w:val="heading 6"/>
     <w:basedOn w:val="1"/>
     <w:next w:val="1"/>
-    <w:link w:val="24"/>
+    <w:link w:val="25"/>
     <w:semiHidden/>
     <w:unhideWhenUsed/>
     <w:qFormat/>
@@ -5323,7 +5437,7 @@
     <w:name w:val="heading 7"/>
     <w:basedOn w:val="1"/>
     <w:next w:val="1"/>
-    <w:link w:val="25"/>
+    <w:link w:val="26"/>
     <w:semiHidden/>
     <w:unhideWhenUsed/>
     <w:qFormat/>
@@ -5351,7 +5465,7 @@
     <w:name w:val="heading 8"/>
     <w:basedOn w:val="1"/>
     <w:next w:val="1"/>
-    <w:link w:val="26"/>
+    <w:link w:val="27"/>
     <w:semiHidden/>
     <w:unhideWhenUsed/>
     <w:qFormat/>
@@ -5381,7 +5495,7 @@
     <w:name w:val="heading 9"/>
     <w:basedOn w:val="1"/>
     <w:next w:val="1"/>
-    <w:link w:val="27"/>
+    <w:link w:val="28"/>
     <w:semiHidden/>
     <w:unhideWhenUsed/>
     <w:qFormat/>
@@ -5416,6 +5530,7 @@
     <w:name w:val="Normal Table"/>
     <w:semiHidden/>
     <w:unhideWhenUsed/>
+    <w:qFormat/>
     <w:uiPriority w:val="99"/>
     <w:tblPr>
       <w:tblCellMar>
@@ -5427,6 +5542,18 @@
     </w:tblPr>
   </w:style>
   <w:style w:type="character" w:styleId="13">
+    <w:name w:val="HTML Code"/>
+    <w:basedOn w:val="11"/>
+    <w:semiHidden/>
+    <w:unhideWhenUsed/>
+    <w:uiPriority w:val="99"/>
+    <w:rPr>
+      <w:rFonts w:ascii="Courier New" w:hAnsi="Courier New" w:cs="Courier New"/>
+      <w:sz w:val="20"/>
+      <w:szCs w:val="20"/>
+    </w:rPr>
+  </w:style>
+  <w:style w:type="character" w:styleId="14">
     <w:name w:val="Hyperlink"/>
     <w:basedOn w:val="11"/>
     <w:unhideWhenUsed/>
@@ -5442,7 +5569,7 @@
       </w14:textFill>
     </w:rPr>
   </w:style>
-  <w:style w:type="paragraph" w:styleId="14">
+  <w:style w:type="paragraph" w:styleId="15">
     <w:name w:val="Normal (Web)"/>
     <w:semiHidden/>
     <w:unhideWhenUsed/>
@@ -5458,7 +5585,7 @@
       <w:lang w:val="en-US" w:eastAsia="zh-CN" w:bidi="ar-SA"/>
     </w:rPr>
   </w:style>
-  <w:style w:type="character" w:styleId="15">
+  <w:style w:type="character" w:styleId="16">
     <w:name w:val="Strong"/>
     <w:basedOn w:val="11"/>
     <w:qFormat/>
@@ -5468,11 +5595,11 @@
       <w:bCs/>
     </w:rPr>
   </w:style>
-  <w:style w:type="paragraph" w:styleId="16">
+  <w:style w:type="paragraph" w:styleId="17">
     <w:name w:val="Subtitle"/>
     <w:basedOn w:val="1"/>
     <w:next w:val="1"/>
-    <w:link w:val="29"/>
+    <w:link w:val="30"/>
     <w:qFormat/>
     <w:uiPriority w:val="11"/>
     <w:rPr>
@@ -5491,7 +5618,7 @@
       </w14:textFill>
     </w:rPr>
   </w:style>
-  <w:style w:type="table" w:styleId="17">
+  <w:style w:type="table" w:styleId="18">
     <w:name w:val="Table Grid"/>
     <w:basedOn w:val="12"/>
     <w:qFormat/>
@@ -5514,11 +5641,11 @@
       </w:tblBorders>
     </w:tblPr>
   </w:style>
-  <w:style w:type="paragraph" w:styleId="18">
+  <w:style w:type="paragraph" w:styleId="19">
     <w:name w:val="Title"/>
     <w:basedOn w:val="1"/>
     <w:next w:val="1"/>
-    <w:link w:val="28"/>
+    <w:link w:val="29"/>
     <w:qFormat/>
     <w:uiPriority w:val="10"/>
     <w:pPr>
@@ -5533,7 +5660,7 @@
       <w:szCs w:val="56"/>
     </w:rPr>
   </w:style>
-  <w:style w:type="character" w:customStyle="1" w:styleId="19">
+  <w:style w:type="character" w:customStyle="1" w:styleId="20">
     <w:name w:val="Heading 1 Char"/>
     <w:basedOn w:val="11"/>
     <w:link w:val="2"/>
@@ -5546,7 +5673,7 @@
       <w:szCs w:val="40"/>
     </w:rPr>
   </w:style>
-  <w:style w:type="character" w:customStyle="1" w:styleId="20">
+  <w:style w:type="character" w:customStyle="1" w:styleId="21">
     <w:name w:val="Heading 2 Char"/>
     <w:basedOn w:val="11"/>
     <w:link w:val="3"/>
@@ -5560,7 +5687,7 @@
       <w:szCs w:val="32"/>
     </w:rPr>
   </w:style>
-  <w:style w:type="character" w:customStyle="1" w:styleId="21">
+  <w:style w:type="character" w:customStyle="1" w:styleId="22">
     <w:name w:val="Heading 3 Char"/>
     <w:basedOn w:val="11"/>
     <w:link w:val="4"/>
@@ -5574,7 +5701,7 @@
       <w:szCs w:val="28"/>
     </w:rPr>
   </w:style>
-  <w:style w:type="character" w:customStyle="1" w:styleId="22">
+  <w:style w:type="character" w:customStyle="1" w:styleId="23">
     <w:name w:val="Heading 4 Char"/>
     <w:basedOn w:val="11"/>
     <w:link w:val="5"/>
@@ -5588,7 +5715,7 @@
       <w:color w:val="2F5597" w:themeColor="accent1" w:themeShade="BF"/>
     </w:rPr>
   </w:style>
-  <w:style w:type="character" w:customStyle="1" w:styleId="23">
+  <w:style w:type="character" w:customStyle="1" w:styleId="24">
     <w:name w:val="Heading 5 Char"/>
     <w:basedOn w:val="11"/>
     <w:link w:val="6"/>
@@ -5600,7 +5727,7 @@
       <w:color w:val="2F5597" w:themeColor="accent1" w:themeShade="BF"/>
     </w:rPr>
   </w:style>
-  <w:style w:type="character" w:customStyle="1" w:styleId="24">
+  <w:style w:type="character" w:customStyle="1" w:styleId="25">
     <w:name w:val="Heading 6 Char"/>
     <w:basedOn w:val="11"/>
     <w:link w:val="7"/>
@@ -5622,7 +5749,7 @@
       </w14:textFill>
     </w:rPr>
   </w:style>
-  <w:style w:type="character" w:customStyle="1" w:styleId="25">
+  <w:style w:type="character" w:customStyle="1" w:styleId="26">
     <w:name w:val="Heading 7 Char"/>
     <w:basedOn w:val="11"/>
     <w:link w:val="8"/>
@@ -5642,7 +5769,7 @@
       </w14:textFill>
     </w:rPr>
   </w:style>
-  <w:style w:type="character" w:customStyle="1" w:styleId="26">
+  <w:style w:type="character" w:customStyle="1" w:styleId="27">
     <w:name w:val="Heading 8 Char"/>
     <w:basedOn w:val="11"/>
     <w:link w:val="9"/>
@@ -5664,7 +5791,7 @@
       </w14:textFill>
     </w:rPr>
   </w:style>
-  <w:style w:type="character" w:customStyle="1" w:styleId="27">
+  <w:style w:type="character" w:customStyle="1" w:styleId="28">
     <w:name w:val="Heading 9 Char"/>
     <w:basedOn w:val="11"/>
     <w:link w:val="10"/>
@@ -5684,10 +5811,10 @@
       </w14:textFill>
     </w:rPr>
   </w:style>
-  <w:style w:type="character" w:customStyle="1" w:styleId="28">
+  <w:style w:type="character" w:customStyle="1" w:styleId="29">
     <w:name w:val="Title Char"/>
     <w:basedOn w:val="11"/>
-    <w:link w:val="18"/>
+    <w:link w:val="19"/>
     <w:qFormat/>
     <w:uiPriority w:val="10"/>
     <w:rPr>
@@ -5698,10 +5825,10 @@
       <w:szCs w:val="56"/>
     </w:rPr>
   </w:style>
-  <w:style w:type="character" w:customStyle="1" w:styleId="29">
+  <w:style w:type="character" w:customStyle="1" w:styleId="30">
     <w:name w:val="Subtitle Char"/>
     <w:basedOn w:val="11"/>
-    <w:link w:val="16"/>
+    <w:link w:val="17"/>
     <w:qFormat/>
     <w:uiPriority w:val="11"/>
     <w:rPr>
@@ -5720,11 +5847,11 @@
       </w14:textFill>
     </w:rPr>
   </w:style>
-  <w:style w:type="paragraph" w:styleId="30">
+  <w:style w:type="paragraph" w:styleId="31">
     <w:name w:val="Quote"/>
     <w:basedOn w:val="1"/>
     <w:next w:val="1"/>
-    <w:link w:val="31"/>
+    <w:link w:val="32"/>
     <w:qFormat/>
     <w:uiPriority w:val="29"/>
     <w:pPr>
@@ -5745,10 +5872,10 @@
       </w14:textFill>
     </w:rPr>
   </w:style>
-  <w:style w:type="character" w:customStyle="1" w:styleId="31">
+  <w:style w:type="character" w:customStyle="1" w:styleId="32">
     <w:name w:val="Quote Char"/>
     <w:basedOn w:val="11"/>
-    <w:link w:val="30"/>
+    <w:link w:val="31"/>
     <w:qFormat/>
     <w:uiPriority w:val="29"/>
     <w:rPr>
@@ -5765,7 +5892,7 @@
       </w14:textFill>
     </w:rPr>
   </w:style>
-  <w:style w:type="paragraph" w:styleId="32">
+  <w:style w:type="paragraph" w:styleId="33">
     <w:name w:val="List Paragraph"/>
     <w:basedOn w:val="1"/>
     <w:qFormat/>
@@ -5775,7 +5902,7 @@
       <w:contextualSpacing/>
     </w:pPr>
   </w:style>
-  <w:style w:type="character" w:customStyle="1" w:styleId="33">
+  <w:style w:type="character" w:customStyle="1" w:styleId="34">
     <w:name w:val="Intense Emphasis1"/>
     <w:basedOn w:val="11"/>
     <w:qFormat/>
@@ -5786,11 +5913,11 @@
       <w:color w:val="2F5597" w:themeColor="accent1" w:themeShade="BF"/>
     </w:rPr>
   </w:style>
-  <w:style w:type="paragraph" w:styleId="34">
+  <w:style w:type="paragraph" w:styleId="35">
     <w:name w:val="Intense Quote"/>
     <w:basedOn w:val="1"/>
     <w:next w:val="1"/>
-    <w:link w:val="35"/>
+    <w:link w:val="36"/>
     <w:qFormat/>
     <w:uiPriority w:val="30"/>
     <w:pPr>
@@ -5808,10 +5935,10 @@
       <w:color w:val="2F5597" w:themeColor="accent1" w:themeShade="BF"/>
     </w:rPr>
   </w:style>
-  <w:style w:type="character" w:customStyle="1" w:styleId="35">
+  <w:style w:type="character" w:customStyle="1" w:styleId="36">
     <w:name w:val="Intense Quote Char"/>
     <w:basedOn w:val="11"/>
-    <w:link w:val="34"/>
+    <w:link w:val="35"/>
     <w:qFormat/>
     <w:uiPriority w:val="30"/>
     <w:rPr>
@@ -5820,7 +5947,7 @@
       <w:color w:val="2F5597" w:themeColor="accent1" w:themeShade="BF"/>
     </w:rPr>
   </w:style>
-  <w:style w:type="character" w:customStyle="1" w:styleId="36">
+  <w:style w:type="character" w:customStyle="1" w:styleId="37">
     <w:name w:val="Intense Reference1"/>
     <w:basedOn w:val="11"/>
     <w:qFormat/>
@@ -5833,7 +5960,7 @@
       <w:spacing w:val="5"/>
     </w:rPr>
   </w:style>
-  <w:style w:type="character" w:customStyle="1" w:styleId="37">
+  <w:style w:type="character" w:customStyle="1" w:styleId="38">
     <w:name w:val="Unresolved Mention1"/>
     <w:basedOn w:val="11"/>
     <w:semiHidden/>

</xml_diff>